<commit_message>
Filled out task description and made a pdf copy to demo in class
</commit_message>
<xml_diff>
--- a/Phase 2/ProjectTasksDescription.docx
+++ b/Phase 2/ProjectTasksDescription.docx
@@ -386,13 +386,26 @@
               </w:rPr>
               <w:t>#2</w:t>
             </w:r>
+            <w:r>
+              <w:rPr>
+                <w:b/>
+                <w:bCs/>
+                <w:sz w:val="24"/>
+                <w:szCs w:val="24"/>
+              </w:rPr>
+              <w:t xml:space="preserve"> James Luciano</w:t>
+            </w:r>
           </w:p>
         </w:tc>
         <w:tc>
           <w:tcPr>
             <w:tcW w:w="5395" w:type="dxa"/>
           </w:tcPr>
-          <w:p/>
+          <w:p>
+            <w:r>
+              <w:t>Developed email and notification logic, connect front end with backend</w:t>
+            </w:r>
+          </w:p>
         </w:tc>
       </w:tr>
       <w:tr>
@@ -423,13 +436,26 @@
               </w:rPr>
               <w:t>#3</w:t>
             </w:r>
+            <w:r>
+              <w:rPr>
+                <w:b/>
+                <w:bCs/>
+                <w:sz w:val="24"/>
+                <w:szCs w:val="24"/>
+              </w:rPr>
+              <w:t xml:space="preserve"> Sean Lussier</w:t>
+            </w:r>
           </w:p>
         </w:tc>
         <w:tc>
           <w:tcPr>
             <w:tcW w:w="5395" w:type="dxa"/>
           </w:tcPr>
-          <w:p/>
+          <w:p>
+            <w:r>
+              <w:t>Worked on motor logic, making the circuit with motor, fan speed control</w:t>
+            </w:r>
+          </w:p>
         </w:tc>
       </w:tr>
       <w:tr>
@@ -460,13 +486,26 @@
               </w:rPr>
               <w:t>#4</w:t>
             </w:r>
+            <w:r>
+              <w:rPr>
+                <w:b/>
+                <w:bCs/>
+                <w:sz w:val="24"/>
+                <w:szCs w:val="24"/>
+              </w:rPr>
+              <w:t xml:space="preserve"> Mohamed Amine Hamidouch</w:t>
+            </w:r>
           </w:p>
         </w:tc>
         <w:tc>
           <w:tcPr>
             <w:tcW w:w="5395" w:type="dxa"/>
           </w:tcPr>
-          <w:p/>
+          <w:p>
+            <w:r>
+              <w:t>Worked Arduino script and building the circuit with the 2 ESP32</w:t>
+            </w:r>
+          </w:p>
         </w:tc>
       </w:tr>
     </w:tbl>

</xml_diff>